<commit_message>
Update to the revised Alzheimer's & Dementia submission (reviewer round 1)
</commit_message>
<xml_diff>
--- a/ms/reference/custom-reference-doc.docx
+++ b/ms/reference/custom-reference-doc.docx
@@ -487,7 +487,7 @@
   <w:docDefaults>
     <w:rPrDefault>
       <w:rPr>
-        <w:rFonts w:asciiTheme="minorHAnsi" w:eastAsiaTheme="minorHAnsi" w:hAnsiTheme="minorHAnsi" w:cstheme="minorBidi"/>
+        <w:rFonts w:ascii="Times New Roman" w:hAnsi="Times New Roman" w:eastAsia="Times New Roman" w:cs="Times New Roman"/>
         <w:sz w:val="24"/>
         <w:szCs w:val="24"/>
         <w:lang w:val="en-US" w:eastAsia="en-US" w:bidi="ar-SA"/>
@@ -495,7 +495,7 @@
     </w:rPrDefault>
     <w:pPrDefault>
       <w:pPr>
-        <w:spacing w:after="200"/>
+        <w:spacing w:after="200" w:line="480" w:lineRule="auto"/>
       </w:pPr>
     </w:pPrDefault>
   </w:docDefaults>
@@ -762,7 +762,7 @@
       <w:outlineLvl w:val="0"/>
     </w:pPr>
     <w:rPr>
-      <w:rFonts w:asciiTheme="majorHAnsi" w:eastAsiaTheme="majorEastAsia" w:hAnsiTheme="majorHAnsi" w:cstheme="majorBidi"/>
+      <w:rFonts w:ascii="Times New Roman" w:hAnsi="Times New Roman" w:eastAsia="Times New Roman" w:cs="Times New Roman"/>
       <w:color w:val="0F4761" w:themeColor="accent1" w:themeShade="BF"/>
       <w:sz w:val="40"/>
       <w:szCs w:val="40"/>
@@ -785,7 +785,7 @@
       <w:outlineLvl w:val="1"/>
     </w:pPr>
     <w:rPr>
-      <w:rFonts w:asciiTheme="majorHAnsi" w:eastAsiaTheme="majorEastAsia" w:hAnsiTheme="majorHAnsi" w:cstheme="majorBidi"/>
+      <w:rFonts w:ascii="Times New Roman" w:hAnsi="Times New Roman" w:eastAsia="Times New Roman" w:cs="Times New Roman"/>
       <w:color w:val="0F4761" w:themeColor="accent1" w:themeShade="BF"/>
       <w:sz w:val="32"/>
       <w:szCs w:val="32"/>
@@ -808,7 +808,7 @@
       <w:outlineLvl w:val="2"/>
     </w:pPr>
     <w:rPr>
-      <w:rFonts w:eastAsiaTheme="majorEastAsia" w:cstheme="majorBidi"/>
+      <w:rFonts w:ascii="Times New Roman" w:hAnsi="Times New Roman" w:eastAsia="Times New Roman" w:cs="Times New Roman"/>
       <w:color w:val="0F4761" w:themeColor="accent1" w:themeShade="BF"/>
       <w:sz w:val="28"/>
       <w:szCs w:val="28"/>
@@ -831,7 +831,7 @@
       <w:outlineLvl w:val="3"/>
     </w:pPr>
     <w:rPr>
-      <w:rFonts w:eastAsiaTheme="majorEastAsia" w:cstheme="majorBidi"/>
+      <w:rFonts w:ascii="Times New Roman" w:hAnsi="Times New Roman" w:eastAsia="Times New Roman" w:cs="Times New Roman"/>
       <w:i/>
       <w:iCs/>
       <w:color w:val="0F4761" w:themeColor="accent1" w:themeShade="BF"/>
@@ -854,7 +854,7 @@
       <w:outlineLvl w:val="4"/>
     </w:pPr>
     <w:rPr>
-      <w:rFonts w:eastAsiaTheme="majorEastAsia" w:cstheme="majorBidi"/>
+      <w:rFonts w:ascii="Times New Roman" w:hAnsi="Times New Roman" w:eastAsia="Times New Roman" w:cs="Times New Roman"/>
       <w:color w:val="0F4761" w:themeColor="accent1" w:themeShade="BF"/>
     </w:rPr>
   </w:style>
@@ -875,7 +875,7 @@
       <w:outlineLvl w:val="5"/>
     </w:pPr>
     <w:rPr>
-      <w:rFonts w:eastAsiaTheme="majorEastAsia" w:cstheme="majorBidi"/>
+      <w:rFonts w:ascii="Times New Roman" w:hAnsi="Times New Roman" w:eastAsia="Times New Roman" w:cs="Times New Roman"/>
       <w:i/>
       <w:iCs/>
       <w:color w:val="595959" w:themeColor="text1" w:themeTint="A6"/>
@@ -898,7 +898,7 @@
       <w:outlineLvl w:val="6"/>
     </w:pPr>
     <w:rPr>
-      <w:rFonts w:eastAsiaTheme="majorEastAsia" w:cstheme="majorBidi"/>
+      <w:rFonts w:ascii="Times New Roman" w:hAnsi="Times New Roman" w:eastAsia="Times New Roman" w:cs="Times New Roman"/>
       <w:color w:val="595959" w:themeColor="text1" w:themeTint="A6"/>
     </w:rPr>
   </w:style>
@@ -919,7 +919,7 @@
       <w:outlineLvl w:val="7"/>
     </w:pPr>
     <w:rPr>
-      <w:rFonts w:eastAsiaTheme="majorEastAsia" w:cstheme="majorBidi"/>
+      <w:rFonts w:ascii="Times New Roman" w:hAnsi="Times New Roman" w:eastAsia="Times New Roman" w:cs="Times New Roman"/>
       <w:i/>
       <w:iCs/>
       <w:color w:val="272727" w:themeColor="text1" w:themeTint="D8"/>
@@ -942,7 +942,7 @@
       <w:outlineLvl w:val="8"/>
     </w:pPr>
     <w:rPr>
-      <w:rFonts w:eastAsiaTheme="majorEastAsia" w:cstheme="majorBidi"/>
+      <w:rFonts w:ascii="Times New Roman" w:hAnsi="Times New Roman" w:eastAsia="Times New Roman" w:cs="Times New Roman"/>
       <w:color w:val="272727" w:themeColor="text1" w:themeTint="D8"/>
     </w:rPr>
   </w:style>
@@ -1010,7 +1010,7 @@
       <w:jc w:val="center"/>
     </w:pPr>
     <w:rPr>
-      <w:rFonts w:asciiTheme="majorHAnsi" w:eastAsiaTheme="majorEastAsia" w:hAnsiTheme="majorHAnsi" w:cstheme="majorBidi"/>
+      <w:rFonts w:ascii="Times New Roman" w:hAnsi="Times New Roman" w:eastAsia="Times New Roman" w:cs="Times New Roman"/>
       <w:spacing w:val="-10"/>
       <w:kern w:val="28"/>
       <w:sz w:val="56"/>
@@ -1024,7 +1024,7 @@
     <w:uiPriority w:val="10"/>
     <w:rsid w:val="00A10FD9"/>
     <w:rPr>
-      <w:rFonts w:asciiTheme="majorHAnsi" w:eastAsiaTheme="majorEastAsia" w:hAnsiTheme="majorHAnsi" w:cstheme="majorBidi"/>
+      <w:rFonts w:ascii="Times New Roman" w:hAnsi="Times New Roman" w:eastAsia="Times New Roman" w:cs="Times New Roman"/>
       <w:spacing w:val="-10"/>
       <w:kern w:val="28"/>
       <w:sz w:val="56"/>
@@ -1045,7 +1045,7 @@
       </w:numPr>
     </w:pPr>
     <w:rPr>
-      <w:rFonts w:eastAsiaTheme="majorEastAsia" w:cstheme="majorBidi"/>
+      <w:rFonts w:ascii="Times New Roman" w:hAnsi="Times New Roman" w:eastAsia="Times New Roman" w:cs="Times New Roman"/>
       <w:color w:val="595959" w:themeColor="text1" w:themeTint="A6"/>
       <w:spacing w:val="15"/>
       <w:sz w:val="28"/>
@@ -1059,7 +1059,7 @@
     <w:uiPriority w:val="11"/>
     <w:rsid w:val="00A10FD9"/>
     <w:rPr>
-      <w:rFonts w:eastAsiaTheme="majorEastAsia" w:cstheme="majorBidi"/>
+      <w:rFonts w:ascii="Times New Roman" w:hAnsi="Times New Roman" w:eastAsia="Times New Roman" w:cs="Times New Roman"/>
       <w:color w:val="595959" w:themeColor="text1" w:themeTint="A6"/>
       <w:spacing w:val="15"/>
       <w:sz w:val="28"/>
@@ -1131,7 +1131,7 @@
     <w:uiPriority w:val="9"/>
     <w:rsid w:val="00A10FD9"/>
     <w:rPr>
-      <w:rFonts w:asciiTheme="majorHAnsi" w:eastAsiaTheme="majorEastAsia" w:hAnsiTheme="majorHAnsi" w:cstheme="majorBidi"/>
+      <w:rFonts w:ascii="Times New Roman" w:hAnsi="Times New Roman" w:eastAsia="Times New Roman" w:cs="Times New Roman"/>
       <w:color w:val="0F4761" w:themeColor="accent1" w:themeShade="BF"/>
       <w:sz w:val="40"/>
       <w:szCs w:val="40"/>
@@ -1145,7 +1145,7 @@
     <w:semiHidden/>
     <w:rsid w:val="00A10FD9"/>
     <w:rPr>
-      <w:rFonts w:asciiTheme="majorHAnsi" w:eastAsiaTheme="majorEastAsia" w:hAnsiTheme="majorHAnsi" w:cstheme="majorBidi"/>
+      <w:rFonts w:ascii="Times New Roman" w:hAnsi="Times New Roman" w:eastAsia="Times New Roman" w:cs="Times New Roman"/>
       <w:color w:val="0F4761" w:themeColor="accent1" w:themeShade="BF"/>
       <w:sz w:val="32"/>
       <w:szCs w:val="32"/>
@@ -1159,7 +1159,7 @@
     <w:semiHidden/>
     <w:rsid w:val="00A10FD9"/>
     <w:rPr>
-      <w:rFonts w:eastAsiaTheme="majorEastAsia" w:cstheme="majorBidi"/>
+      <w:rFonts w:ascii="Times New Roman" w:hAnsi="Times New Roman" w:eastAsia="Times New Roman" w:cs="Times New Roman"/>
       <w:color w:val="0F4761" w:themeColor="accent1" w:themeShade="BF"/>
       <w:sz w:val="28"/>
       <w:szCs w:val="28"/>
@@ -1173,7 +1173,7 @@
     <w:semiHidden/>
     <w:rsid w:val="00A10FD9"/>
     <w:rPr>
-      <w:rFonts w:eastAsiaTheme="majorEastAsia" w:cstheme="majorBidi"/>
+      <w:rFonts w:ascii="Times New Roman" w:hAnsi="Times New Roman" w:eastAsia="Times New Roman" w:cs="Times New Roman"/>
       <w:i/>
       <w:iCs/>
       <w:color w:val="0F4761" w:themeColor="accent1" w:themeShade="BF"/>
@@ -1187,7 +1187,7 @@
     <w:semiHidden/>
     <w:rsid w:val="00A10FD9"/>
     <w:rPr>
-      <w:rFonts w:eastAsiaTheme="majorEastAsia" w:cstheme="majorBidi"/>
+      <w:rFonts w:ascii="Times New Roman" w:hAnsi="Times New Roman" w:eastAsia="Times New Roman" w:cs="Times New Roman"/>
       <w:color w:val="0F4761" w:themeColor="accent1" w:themeShade="BF"/>
     </w:rPr>
   </w:style>
@@ -1199,7 +1199,7 @@
     <w:semiHidden/>
     <w:rsid w:val="00A10FD9"/>
     <w:rPr>
-      <w:rFonts w:eastAsiaTheme="majorEastAsia" w:cstheme="majorBidi"/>
+      <w:rFonts w:ascii="Times New Roman" w:hAnsi="Times New Roman" w:eastAsia="Times New Roman" w:cs="Times New Roman"/>
       <w:i/>
       <w:iCs/>
       <w:color w:val="595959" w:themeColor="text1" w:themeTint="A6"/>
@@ -1213,7 +1213,7 @@
     <w:semiHidden/>
     <w:rsid w:val="00A10FD9"/>
     <w:rPr>
-      <w:rFonts w:eastAsiaTheme="majorEastAsia" w:cstheme="majorBidi"/>
+      <w:rFonts w:ascii="Times New Roman" w:hAnsi="Times New Roman" w:eastAsia="Times New Roman" w:cs="Times New Roman"/>
       <w:color w:val="595959" w:themeColor="text1" w:themeTint="A6"/>
     </w:rPr>
   </w:style>
@@ -1225,7 +1225,7 @@
     <w:semiHidden/>
     <w:rsid w:val="00A10FD9"/>
     <w:rPr>
-      <w:rFonts w:eastAsiaTheme="majorEastAsia" w:cstheme="majorBidi"/>
+      <w:rFonts w:ascii="Times New Roman" w:hAnsi="Times New Roman" w:eastAsia="Times New Roman" w:cs="Times New Roman"/>
       <w:i/>
       <w:iCs/>
       <w:color w:val="272727" w:themeColor="text1" w:themeTint="D8"/>
@@ -1239,7 +1239,7 @@
     <w:semiHidden/>
     <w:rsid w:val="00A10FD9"/>
     <w:rPr>
-      <w:rFonts w:eastAsiaTheme="majorEastAsia" w:cstheme="majorBidi"/>
+      <w:rFonts w:ascii="Times New Roman" w:hAnsi="Times New Roman" w:eastAsia="Times New Roman" w:cs="Times New Roman"/>
       <w:color w:val="272727" w:themeColor="text1" w:themeTint="D8"/>
     </w:rPr>
   </w:style>
@@ -1442,7 +1442,7 @@
     </a:clrScheme>
     <a:fontScheme name="Office">
       <a:majorFont>
-        <a:latin typeface="Aptos Display" panose="02110004020202020204"/>
+        <a:latin typeface="Times New Roman"/>
         <a:ea typeface=""/>
         <a:cs typeface=""/>
         <a:font script="Jpan" typeface="游ゴシック Light"/>
@@ -1494,7 +1494,7 @@
         <a:font script="Tfng" typeface="Ebrima"/>
       </a:majorFont>
       <a:minorFont>
-        <a:latin typeface="Aptos" panose="02110004020202020204"/>
+        <a:latin typeface="Times New Roman"/>
         <a:ea typeface=""/>
         <a:cs typeface=""/>
         <a:font script="Jpan" typeface="游明朝"/>

</xml_diff>